<commit_message>
Clean up submission text, report and website
</commit_message>
<xml_diff>
--- a/reports/SecureBase_Modul_1_2_3_4_5_6_DOKUMENTATION.docx
+++ b/reports/SecureBase_Modul_1_2_3_4_5_6_DOKUMENTATION.docx
@@ -45,7 +45,7 @@
           <w:b/>
           <w:sz w:val="32"/>
         </w:rPr>
-        <w:t>Samlet dokumentation – Linux 101</w:t>
+        <w:t xml:space="preserve">Samlet dokumentation – Linux 101 · Kasper</w:t>
       </w:r>
     </w:p>
     <w:tbl>
@@ -244,7 +244,7 @@
               </w:rPr>
               <w:t>Modul 1–6 gennemført og dokumenteret</w:t>
               <w:br/>
-              <w:t>Senest udvidet: 17. september 2026</w:t>
+              <w:t>Redigeret: 19. september 2026</w:t>
             </w:r>
           </w:p>
         </w:tc>
@@ -291,7 +291,7 @@
         <w:rPr>
           <w:lang w:val="da-DK"/>
         </w:rPr>
-        <w:t>Rapporten samler Modul 1–6 med konfigurationer, sikkerhedsbegrundelser og terminalbeviser. Modul 1–5 viser det manuelle arbejdsforløb. Modul 6 afslutter med deployment på en separat Ubuntu-test-VM, selvstændigt healthcheck og genkørsel med 0 ændrede administrerede filer.</w:t>
+        <w:t xml:space="preserve">Rapporten samler Modul 1–6 med konfigurationer, sikkerhedsbegrundelser og terminalbeviser. Modul 1–5 viser det manuelle forløb; Modul 6 dokumenterer deployment og genkørsel. Afsnit 20 samler den aktuelle scriptvejledning og testreference.</w:t>
       </w:r>
     </w:p>
     <w:p>
@@ -2325,7 +2325,7 @@
         <w:rPr>
           <w:lang w:val="da-DK"/>
         </w:rPr>
-        <w:t>’</w:t>
+        <w:t xml:space="preserve"/>
       </w:r>
     </w:p>
     <w:p>
@@ -11364,7 +11364,7 @@
         <w:keepNext w:val="0"/>
       </w:pPr>
       <w:r>
-        <w:t>Grundlag: Linux 101, Modul 3: Bruger- og gruppestyring, opgaver og dokumentationskrav (side 6), samt de uploadede terminalbilleder fra det gennemførte arbejde. Figurerne gengiver brugerens egne resultater; udvalgte billeder er beskåret til det relevante udsnit.</w:t>
+        <w:t xml:space="preserve">Grundlag: Linux 101, Modul 3: Bruger- og gruppestyring, opgaver og dokumentationskrav (side 6), samt terminalbillederne fra det gennemførte arbejde. Figurerne gengiver de dokumenterede resultater; udvalgte billeder er beskåret til det relevante udsnit.</w:t>
       </w:r>
     </w:p>
     <w:p>
@@ -11482,7 +11482,7 @@
         <w:drawing>
           <wp:inline xmlns:a="http://schemas.openxmlformats.org/drawingml/2006/main" xmlns:pic="http://schemas.openxmlformats.org/drawingml/2006/picture">
             <wp:extent cx="4896000" cy="1182572"/>
-            <wp:docPr id="9" name="Picture 9" descr="Figur 3.2. Rollegrupperne admins, developers og guests er oprettet med GID 1004, 1005 og 1006. Udsnit af det uploadede terminalbillede." title="Modul 3 – figur 2"/>
+            <wp:docPr id="9" name="Picture 9" descr="Figur 3.2. Rollegrupperne admins, developers og guests er oprettet med GID 1004, 1005 og 1006. Udsnit af terminalbilledet." title="Modul 3 – figur 2"/>
             <wp:cNvGraphicFramePr>
               <a:graphicFrameLocks noChangeAspect="1"/>
             </wp:cNvGraphicFramePr>
@@ -11519,7 +11519,7 @@
         <w:keepNext w:val="0"/>
       </w:pPr>
       <w:r>
-        <w:t>Figur 3.2. Rollegrupperne admins, developers og guests er oprettet med GID 1004, 1005 og 1006. Udsnit af det uploadede terminalbillede.</w:t>
+        <w:t xml:space="preserve">Figur 3.2. Rollegrupperne admins, developers og guests er oprettet med GID 1004, 1005 og 1006. Udsnit af terminalbilledet.</w:t>
       </w:r>
     </w:p>
     <w:p>
@@ -11528,7 +11528,7 @@
         <w:keepNext w:val="0"/>
       </w:pPr>
       <w:r>
-        <w:t>De to brugere developer1 og guest1 blev oprettet med adduser. Derefter blev kontiene tilknyttet deres respektive rollegrupper; resultatet er dokumenteret med id og et uddrag af /etc/group på næste side.</w:t>
+        <w:t xml:space="preserve">De to brugere developer1 og guest1 blev oprettet med adduser. Derefter blev kontiene tilknyttet deres respektive rollegrupper; resultatet er dokumenteret med id og et uddrag af /etc/group i næste afsnit.</w:t>
       </w:r>
     </w:p>
     <w:p>
@@ -12450,7 +12450,7 @@
         <w:keepNext w:val="0"/>
       </w:pPr>
       <w:r>
-        <w:t>Læringspunkt: Adgangs-ACL gælder det eksisterende objekt; default ACL er et udgangspunkt ved oprettelse. De effektive filrettigheder blev derfor også kontrolleret på en ny fil, som vist på næste side.</w:t>
+        <w:t xml:space="preserve">Læringspunkt: Adgangs-ACL gælder det eksisterende objekt; default ACL er et udgangspunkt ved oprettelse. De effektive filrettigheder blev derfor også kontrolleret på en ny fil, som vist i næste afsnit.</w:t>
       </w:r>
     </w:p>
     <w:p>
@@ -12918,7 +12918,7 @@
         <w:drawing>
           <wp:inline xmlns:a="http://schemas.openxmlformats.org/drawingml/2006/main" xmlns:pic="http://schemas.openxmlformats.org/drawingml/2006/picture">
             <wp:extent cx="6346188" cy="1126448"/>
-            <wp:docPr id="16" name="Picture 16" descr="Figur 3.9. Gæsten læser begge linjer. Skrivning til rolletest.txt og oprettelse af guest-test.txt afvises. Den afsluttende læsning viser uændret indhold. Udsnit af det uploadede billede." title="Modul 3 – figur 9"/>
+            <wp:docPr id="16" name="Picture 16" descr="Figur 3.9. Gæsten læser begge linjer. Skrivning til rolletest.txt og oprettelse af guest-test.txt afvises. Den afsluttende læsning viser uændret indhold. Udsnit af terminalbilledet." title="Modul 3 – figur 9"/>
             <wp:cNvGraphicFramePr>
               <a:graphicFrameLocks noChangeAspect="1"/>
             </wp:cNvGraphicFramePr>
@@ -12955,7 +12955,7 @@
         <w:keepNext w:val="0"/>
       </w:pPr>
       <w:r>
-        <w:t>Figur 3.9. Gæsten læser begge linjer. Skrivning til rolletest.txt og oprettelse af guest-test.txt afvises. Den afsluttende læsning viser uændret indhold. Udsnit af det uploadede billede.</w:t>
+        <w:t xml:space="preserve">Figur 3.9. Gæsten læser begge linjer. Skrivning til rolletest.txt og oprettelse af guest-test.txt afvises. Den afsluttende læsning viser uændret indhold. Udsnit af terminalbilledet.</w:t>
       </w:r>
     </w:p>
     <w:tbl>
@@ -15009,7 +15009,7 @@
         <w:keepNext w:val="0"/>
       </w:pPr>
       <w:r>
-        <w:t>Beviserne dækker de viste filer, roller, kommandoer og testtidspunkter. Developerens skriveadgang er demonstreret ved ændring af en anden brugers fil; separat oprettelse eller sletning som developer1 er ikke vist. Rapporten hævder ikke, at yderligere sikkerhedstests eller senere moduler er gennemført.</w:t>
+        <w:t xml:space="preserve">Beviserne dækker de viste filer, roller, kommandoer og testtidspunkter. Developerens skriveadgang er demonstreret ved ændring af en anden brugers fil; separat oprettelse eller sletning som developer1 er ikke vist. Beviserne i dette afsnit er afgrænset til Modul 3.</w:t>
       </w:r>
     </w:p>
     <w:p>
@@ -15393,7 +15393,7 @@
         <w:pStyle w:val="M4Small"/>
       </w:pPr>
       <w:r>
-        <w:t>Grundlag: Linux 101, Modul 4: Firewall og netværkssikkerhed (side 6), samt de uploadede terminalbilleder fra forløbet. Figur 4.1–4.19 er brugerens egne screenshots; udsnit er markeret. Testtilstand og endelig konfiguration holdes adskilt.</w:t>
+        <w:t xml:space="preserve">Grundlag: Linux 101, Modul 4: Firewall og netværkssikkerhed (side 6), samt terminalbillederne fra forløbet. Figur 4.1–4.19 er screenshots fra testforløbet; udsnit er markeret. Testtilstand og endelig konfiguration holdes adskilt.</w:t>
       </w:r>
     </w:p>
     <w:p>
@@ -15726,7 +15726,7 @@
         <w:pStyle w:val="M4Small"/>
       </w:pPr>
       <w:r>
-        <w:t>Den første journalctl/grep-kontrol gav ingen matchende linjer i det viste logudsnit. Derfor blev den aktive forbindelse kontrolleret direkte med ss. En tom, filtreret logvisning blev ikke brugt som bevis for, at SSH var nede.</w:t>
+        <w:t xml:space="preserve">Den aktive SSH-forbindelses kildeadresse blev kontrolleret direkte med ss.</w:t>
       </w:r>
     </w:p>
     <w:p>
@@ -17128,7 +17128,7 @@
         <w:pStyle w:val="M4Small"/>
       </w:pPr>
       <w:r>
-        <w:t>tee viser outputtet og skriver det til filen. Uden -a overskrives filen; cat læser den gemte fil tilbage. Den første fejlslagne filkontrol viste hjælpetekst, men blev efterfulgt af den korrekte eksport, som er vist her.</w:t>
+        <w:t xml:space="preserve">tee viser outputtet og skriver det til filen. Uden -a overskrives filen; cat læser den gemte fil tilbage.</w:t>
       </w:r>
     </w:p>
     <w:p>
@@ -17455,7 +17455,7 @@
               <w:pStyle w:val="M4Table"/>
             </w:pPr>
             <w:r>
-              <w:t>Der er ikke uploadet bevis for sletning af denne værtsregel. Rapporten markerer derfor ikke dette som udført.</w:t>
+              <w:t xml:space="preserve">Sletning af denne værtsregel er ikke dokumenteret.</w:t>
             </w:r>
           </w:p>
         </w:tc>
@@ -18342,7 +18342,7 @@
         <w:pStyle w:val="M4Small"/>
       </w:pPr>
       <w:r>
-        <w:t>Afleveringsgrundlag: Linux 101, side 6, Modul 4. Opgavens krav og dokumentationskrav er koblet til figurer og afsnit ovenfor. Forløbet dokumenterer ikke nye tests af Modul 1–3 eller gennemførelse af Modul 5–6.</w:t>
+        <w:t xml:space="preserve">Afleveringsgrundlag: Linux 101, side 6, Modul 4. Opgavens krav og dokumentationskrav er koblet til figurer og afsnit ovenfor. Beviserne i dette afsnit er afgrænset til firewallforløbet i Modul 4.</w:t>
       </w:r>
     </w:p>
     <w:p>
@@ -18927,7 +18927,7 @@
         <w:pStyle w:val="M5Body"/>
       </w:pPr>
       <w:r>
-        <w:t>Figurerne er udvalgt fra de uploadede terminalbilleder. Tiderne i de viste målinger og journaludsnit er UTC, hvor det fremgår af materialet. Simulerede grænseoverskridelser og den manuelle TEST WARNING holdes adskilt fra normal drift.</w:t>
+        <w:t xml:space="preserve">Figurerne er udvalgt fra terminalbillederne. Tiderne i de viste målinger og journaludsnit er UTC, hvor det fremgår af materialet. Simulerede grænseoverskridelser og den manuelle TEST WARNING holdes adskilt fra normal drift.</w:t>
       </w:r>
     </w:p>
     <w:p>
@@ -21917,7 +21917,7 @@
         <w:pStyle w:val="M5H2"/>
       </w:pPr>
       <w:r>
-        <w:t>Kort beskrivelse til afleveringen</w:t>
+        <w:t xml:space="preserve">Vurdering af loginmønstre</w:t>
       </w:r>
     </w:p>
     <w:p>
@@ -24718,7 +24718,7 @@
         <w:pStyle w:val="M6Small"/>
       </w:pPr>
       <w:r>
-        <w:t>Grundlag: Linux 101, Modul 6, side 7–8; den leverede SecureBase_Modul6-pakke; og brugerens screenshots. Tidligere moduler er bevaret som historik. Kildetekst og konfigurationsprincipper beskrives ud fra de faktiske filer – ikke kun den oprindelige plan.</w:t>
+        <w:t xml:space="preserve">Grundlag: Linux 101, Modul 6, side 7–8; SecureBase-kildekoden og screenshots fra testforløbet. Figur 6.1–6.18 dokumenterer testen den 17. september 2026. Den efterfølgende test og aktuelle scriptstier er samlet i afsnit 20.</w:t>
       </w:r>
     </w:p>
     <w:p>
@@ -25184,7 +25184,7 @@
         <w:keepLines/>
       </w:pPr>
       <w:r>
-        <w:t>Figur 6.1. Arkivet hentes med HTTP 200, gemmes med 38.017 bytes og udpakkes. Mappen indeholder blandt andet setup.sh, healthcheck.sh, config.env, keys og modules. (Udsnit af uploadet screenshot.)</w:t>
+        <w:t xml:space="preserve">Figur 6.1. Arkivet hentes med HTTP 200, gemmes med 38.017 bytes og udpakkes. Mappen indeholder blandt andet setup.sh, healthcheck.sh, config.env, keys og modules. (Udsnit af terminal-screenshot.)</w:t>
       </w:r>
     </w:p>
     <w:p>
@@ -25572,7 +25572,7 @@
         <w:pStyle w:val="M6Small"/>
       </w:pPr>
       <w:r>
-        <w:t>Dette dokumenterer forudsætningskontrol, ikke en færdig installation. --check er preflight og ikke en fuld simulering af alle ændringer. Netværksvalget ændres eksplicit på den næste side.</w:t>
+        <w:t xml:space="preserve">Dette dokumenterer forudsætningskontrol, ikke en færdig installation. --check er preflight og ikke en fuld simulering af alle ændringer. Netværksvalget ændres eksplicit i næste afsnit.</w:t>
       </w:r>
     </w:p>
     <w:p>
@@ -26704,7 +26704,7 @@
         <w:keepLines/>
       </w:pPr>
       <w:r>
-        <w:t>Figur 6.6. Første kørsel opretter roller og brugere, konfigurerer ACL og installerer authorized_keys. Derefter stopper scriptet ved den planlagte eksterne SSH-test. (Udsnit af uploadet screenshot.)</w:t>
+        <w:t xml:space="preserve">Figur 6.6. Første kørsel opretter roller og brugere, konfigurerer ACL og installerer authorized_keys. Derefter stopper scriptet ved den planlagte eksterne SSH-test. (Udsnit af terminal-screenshot.)</w:t>
       </w:r>
     </w:p>
     <w:p>
@@ -27229,7 +27229,7 @@
         <w:keepLines/>
       </w:pPr>
       <w:r>
-        <w:t>Figur 6.8. Første apply afsluttes med 12 ændrede administrerede filer og healthcheck-resultatet 19 OK, 1 WARN, 0 FAIL. Log- og backupplacering oplyses. (Udsnit af uploadet screenshot.)</w:t>
+        <w:t xml:space="preserve">Figur 6.8. Første apply afsluttes med 12 ændrede administrerede filer og healthcheck-resultatet 19 OK, 1 WARN, 0 FAIL. Log- og backupplacering oplyses. (Udsnit af terminal-screenshot.)</w:t>
       </w:r>
     </w:p>
     <w:p>
@@ -27237,7 +27237,7 @@
         <w:pStyle w:val="M6Body"/>
       </w:pPr>
       <w:r>
-        <w:t>Den første gennemførte kørsel bruges som reference. Det selvstændige healthcheck og den efterfølgende genkørsel dokumenteres på de næste sider.</w:t>
+        <w:t xml:space="preserve">Den første gennemførte kørsel bruges som reference. Det selvstændige healthcheck og den efterfølgende genkørsel dokumenteres i de næste afsnit.</w:t>
       </w:r>
     </w:p>
     <w:p>
@@ -28544,7 +28544,7 @@
         <w:pStyle w:val="M6Small"/>
       </w:pPr>
       <w:r>
-        <w:t>Kildested: healthcheck.sh, afsnittet UID 0-audit. Udsnittet er fra den leverede kode. Resultatet gælder de konti, som det viste NSS-opslag returnerede, ikke en fuldstændig sikkerhedsaudit af alle mulige identitetskilder.</w:t>
+        <w:t xml:space="preserve">Kildested: healthcheck.sh, afsnittet UID 0-audit. Udsnittet er fra kildekoden. Resultatet gælder de konti, som det viste NSS-opslag returnerede, ikke en fuldstændig sikkerhedsaudit af alle mulige identitetskilder.</w:t>
       </w:r>
     </w:p>
     <w:p>
@@ -29522,7 +29522,7 @@
         <w:keepLines/>
       </w:pPr>
       <w:r>
-        <w:t>Figur 6.12. Projekt-ACL er allerede korrekt; authorized_keys, SSH-konfiguration og sudoers er uændrede. KEY-OK er indtastet ved sikkerhedsstoppet, og sudo-politikken er de tre forventede kommandoer. (Udsnit af uploadet screenshot.)</w:t>
+        <w:t xml:space="preserve">Figur 6.12. Projekt-ACL er allerede korrekt; authorized_keys, SSH-konfiguration og sudoers er uændrede. KEY-OK er indtastet ved sikkerhedsstoppet, og sudo-politikken er de tre forventede kommandoer. (Udsnit af terminal-screenshot.)</w:t>
       </w:r>
     </w:p>
     <w:p>
@@ -29907,7 +29907,7 @@
         <w:keepLines/>
       </w:pPr>
       <w:r>
-        <w:t>Figur 6.13. UFW-kildereglen findes allerede; kun TCP/22 fra 10.0.2.2 står som eksplicit brugerregel. Monitor-script og monitor.conf er uændrede. (Udsnit af uploadet screenshot.)</w:t>
+        <w:t xml:space="preserve">Figur 6.13. UFW-kildereglen findes allerede; kun TCP/22 fra 10.0.2.2 står som eksplicit brugerregel. Monitor-script og monitor.conf er uændrede. (Udsnit af terminal-screenshot.)</w:t>
       </w:r>
     </w:p>
     <w:p>
@@ -29958,7 +29958,7 @@
         <w:keepLines/>
       </w:pPr>
       <w:r>
-        <w:t>Figur 6.14. Cronfilen er uændret; cron, logrotate og rsyslog er aktive. En ny monitor-måling tilføjes uden at slette loghistorik. (Udsnit af uploadet screenshot.)</w:t>
+        <w:t xml:space="preserve">Figur 6.14. Cronfilen er uændret; cron, logrotate og rsyslog er aktive. En ny monitor-måling tilføjes uden at slette loghistorik. (Udsnit af terminal-screenshot.)</w:t>
       </w:r>
     </w:p>
     <w:p>
@@ -30009,7 +30009,7 @@
         <w:keepLines/>
       </w:pPr>
       <w:r>
-        <w:t>Figur 6.15. Netplan er allerede konfigureret og genindlæses ikke. Den installerede healthcheck og dens konfiguration er også uændrede. (Udsnit af uploadet screenshot.)</w:t>
+        <w:t xml:space="preserve">Figur 6.15. Netplan er allerede konfigureret og genindlæses ikke. Den installerede healthcheck og dens konfiguration er også uændrede. (Udsnit af terminal-screenshot.)</w:t>
       </w:r>
     </w:p>
     <w:p>
@@ -30085,7 +30085,7 @@
         <w:keepLines/>
       </w:pPr>
       <w:r>
-        <w:t>Figur 6.16. Anden kørsel afsluttes med 19 OK, 1 WARN, 0 FAIL og Aendrede administrerede filer i denne koersel: 0. En ny deployment-log er oprettet; førstegangsbackups bevares. (Udsnit af uploadet screenshot.)</w:t>
+        <w:t xml:space="preserve">Figur 6.16. Anden kørsel afsluttes med 19 OK, 1 WARN, 0 FAIL og Aendrede administrerede filer i denne koersel: 0. En ny deployment-log er oprettet; førstegangsbackups bevares. (Udsnit af terminal-screenshot.)</w:t>
       </w:r>
     </w:p>
     <w:p>
@@ -30245,7 +30245,7 @@
         <w:pageBreakBefore/>
       </w:pPr>
       <w:r>
-        <w:t>16. Kort kørselsvejledning til afleveringen</w:t>
+        <w:t xml:space="preserve">16. Kørsel fra den aktuelle repo-struktur</w:t>
       </w:r>
     </w:p>
     <w:p>
@@ -30253,7 +30253,7 @@
         <w:pStyle w:val="M6Body"/>
       </w:pPr>
       <w:r>
-        <w:t>Kildepakken og denne rapport har forskellige roller: pakken indeholder den fulde, kommenterede kode, mens rapporten forklarer modellen og dokumenterer kørslerne. På en ny VM tilpasses config.env og public key, før apply bruges.</w:t>
+        <w:t xml:space="preserve">Kildekoden ligger under scripts/. På en ny VM tilpasses config.env og den offentlige SSH-nøgle, før apply bruges. Den følgende vejledning bruger de aktuelle stier; de foregående screenshots bevarer den oprindelige tests stier.</w:t>
       </w:r>
     </w:p>
     <w:p>
@@ -30272,13 +30272,13 @@
         <w:ind w:left="144" w:right="86"/>
       </w:pPr>
       <w:r>
-        <w:t>tar -xzf SecureBase_Modul6.tar.gz</w:t>
+        <w:t>cd SecureBase-Linux101</w:t>
         <w:br/>
-        <w:t>cd securebase-deployment</w:t>
+        <w:t>cp -n config/config.env.example config.env</w:t>
         <w:br/>
         <w:t>nano config.env</w:t>
         <w:br/>
-        <w:t>sudo bash ./setup.sh --check</w:t>
+        <w:t>sudo bash scripts/setup.sh --check</w:t>
       </w:r>
     </w:p>
     <w:p>
@@ -30305,13 +30305,13 @@
         <w:ind w:left="144" w:right="86"/>
       </w:pPr>
       <w:r>
-        <w:t>sudo bash ./setup.sh --apply --console-confirmed</w:t>
+        <w:t>sudo bash scripts/setup.sh --apply --console-confirmed</w:t>
         <w:br/>
-        <w:t># Ved det planlagte stop, i Windows PowerShell:</w:t>
+        <w:t># Ved sikkerhedsstoppet, i Windows PowerShell:</w:t>
         <w:br/>
         <w:t>ssh -o PasswordAuthentication=no -p 2222 secureadmin@127.0.0.1</w:t>
         <w:br/>
-        <w:t># Bekræft først KEY-OK i deployment-konsollen efter fungerende login.</w:t>
+        <w:t># Bekræft KEY-OK i deployment-konsollen efter vellykket login.</w:t>
       </w:r>
     </w:p>
     <w:p>
@@ -30338,9 +30338,9 @@
         <w:ind w:left="144" w:right="86"/>
       </w:pPr>
       <w:r>
-        <w:t>sudo ./healthcheck.sh</w:t>
+        <w:t>sudo bash scripts/healthcheck.sh</w:t>
         <w:br/>
-        <w:t>sudo bash ./setup.sh --apply --console-confirmed</w:t>
+        <w:t>sudo bash scripts/setup.sh --apply --console-confirmed</w:t>
         <w:br/>
         <w:t># Installeret kontrolværktøj, uafhængigt af projektmappen:</w:t>
         <w:br/>
@@ -30360,7 +30360,7 @@
         <w:pStyle w:val="M6Small"/>
       </w:pPr>
       <w:r>
-        <w:t>Pakkens README.md, START_HER.html og docs/LOCAL_TEST_REPORT.txt beskriver status ved udleveringen, hvor Ubuntu-testen endnu afventede. Dette modul dokumenterer den efterfølgende faktiske VM-test og erstatter den historiske afventer-status for de her viste kontroller.</w:t>
+        <w:t xml:space="preserve">Den aktuelle scriptvejledning beskriver alle 18 filer med formål og kørsel. Interne moduler startes gennem setup.sh. Afsnit 20 indeholder den samlede oversigt og eksempeloutput fra det færdige system.</w:t>
       </w:r>
     </w:p>
     <w:p>
@@ -30369,7 +30369,7 @@
         <w:pageBreakBefore/>
       </w:pPr>
       <w:r>
-        <w:t>17. Kildekode og scriptoversigt</w:t>
+        <w:t xml:space="preserve">17. Kildekode ved det første deployment</w:t>
       </w:r>
     </w:p>
     <w:p>
@@ -30377,7 +30377,7 @@
         <w:pStyle w:val="M6Body"/>
       </w:pPr>
       <w:r>
-        <w:t>Alle scripts afleveres som filer i SecureBase_Modul6.tar.gz eller SecureBase_Modul6.zip. Arkiverne indeholder samme deployment-projekt. Rapportens uddrag erstatter ikke kildefilerne; hele mappestrukturen skal følge med ved aflevering.</w:t>
+        <w:t xml:space="preserve">Oversigten viser filnavnene ved testen den 17. september 2026. Kode og konfiguration blev efterfølgende samlet under scripts/ og config/. De aktuelle placeringer og kørselsmåder fremgår af afsnit 20; kodeudsnit erstatter ikke de komplette kildefiler.</w:t>
       </w:r>
     </w:p>
     <w:tbl>
@@ -31391,7 +31391,7 @@
         <w:pStyle w:val="M6Small"/>
       </w:pPr>
       <w:r>
-        <w:t>Kildehenvisninger i Modul 6 angiver disse filnavne og funktioner. Figurer 6.1–6.18 henviser til brugerens uploadede terminalbilleder fra fresh-install-testen og slutkontrollerne.</w:t>
+        <w:t xml:space="preserve">Figur 6.1–6.18 viser terminalkørsler fra den oprindelige fresh-install-test. Den daterede billedserie fra 18. september dokumenterer den efterfølgende test af scripts/-strukturen.</w:t>
       </w:r>
     </w:p>
     <w:p>
@@ -32200,7 +32200,7 @@
         <w:pStyle w:val="M6Small"/>
       </w:pPr>
       <w:r>
-        <w:t>Grundlag for kravene: Linux 101.pdf, Modul 6, side 7–8. Den inkluderede lokale testsuite-rapport dokumenterer 20 tidligere container-tests; VM-beviserne i dette modul er en anden og efterfølgende testfase.</w:t>
+        <w:t xml:space="preserve">Kravgrundlag: Linux 101.pdf, Modul 6, side 7–8. Lokale kodetests og faktiske VM-kørsler er forskellige kontroller. De aktuelle scriptkommentarer og kørselsoplysninger er samlet i afsnit 20.</w:t>
       </w:r>
     </w:p>
     <w:p>
@@ -32608,7 +32608,7 @@
         <w:pStyle w:val="M6H2"/>
       </w:pPr>
       <w:r>
-        <w:t>Aflevering</w:t>
+        <w:t xml:space="preserve">Samlet materiale</w:t>
       </w:r>
     </w:p>
     <w:p>
@@ -32616,7 +32616,7 @@
         <w:pStyle w:val="M6Body"/>
       </w:pPr>
       <w:r>
-        <w:t>Aflever denne samlede Word-rapport sammen med deployment-arkivet. Rapporten dokumenterer forløbet og resultaterne; arkivet indeholder de kommenterede scripts, konfigurationseksempel, public key og kørselsvejledning. Den private SSH-nøgle indgår ikke i materialet.</w:t>
+        <w:t xml:space="preserve">Afleveringen består af rapport, kommenterede scripts, konfigurationsskabelon og testbeviser. Den komplette kildekode og den daterede VM-verifikation findes i projektets repo og på afleveringssitet. Den private SSH-nøgle indgår ikke.</w:t>
       </w:r>
     </w:p>
     <w:p>
@@ -32626,6 +32626,1207 @@
       <w:r>
         <w:t>Endelig status: De planlagte moduler og de viste tests er gennemført. Den dokumenterede who/utmp-advarsel og løsningens lab-afgrænsninger er bevaret som en del af en præcis beskrivelse af, hvad kontrollen viser.</w:t>
       </w:r>
+    </w:p>
+    <w:p>
+      <w:pPr>
+        <w:pStyle w:val="M6H1"/>
+        <w:pageBreakBefore/>
+      </w:pPr>
+      <w:r>
+        <w:t>20. Aktuel scriptvejledning</w:t>
+      </w:r>
+    </w:p>
+    <w:p>
+      <w:pPr>
+        <w:pStyle w:val="M6H2"/>
+      </w:pPr>
+      <w:r>
+        <w:t>Modul 6 · kommenterede scripts og kørsel</w:t>
+      </w:r>
+    </w:p>
+    <w:p>
+      <w:pPr>
+        <w:pStyle w:val="M6Body"/>
+      </w:pPr>
+      <w:r>
+        <w:t>Alle 18 scriptfiler under scripts/ har topkommentarer med formål og KØRSEL. De følgende tabeller angiver brugen af hver fil. Stier er relative til repo-roden. Interne moduler og biblioteket køres ikke direkte.</w:t>
+      </w:r>
+    </w:p>
+    <w:tbl>
+      <w:tblPr>
+        <w:tblW w:type="auto" w:w="0"/>
+        <w:jc w:val="center"/>
+        <w:tblLayout w:type="fixed"/>
+        <w:tblLook w:firstColumn="1" w:firstRow="1" w:lastColumn="0" w:lastRow="0" w:noHBand="0" w:noVBand="1" w:val="04A0"/>
+      </w:tblPr>
+      <w:tblGrid>
+        <w:gridCol w:w="4320"/>
+        <w:gridCol w:w="5328"/>
+      </w:tblGrid>
+      <w:tr>
+        <w:trPr>
+          <w:tblHeader/>
+        </w:trPr>
+        <w:tc>
+          <w:tcPr>
+            <w:tcW w:type="dxa" w:w="4997"/>
+            <w:vAlign w:val="center"/>
+            <w:shd w:fill="15364B"/>
+          </w:tcPr>
+          <w:p>
+            <w:pPr>
+              <w:pStyle w:val="M6Small"/>
+              <w:spacing w:after="80" w:before="80"/>
+            </w:pPr>
+            <w:r>
+              <w:rPr>
+                <w:b/>
+                <w:color w:val="FFFFFF"/>
+                <w:sz w:val="18"/>
+              </w:rPr>
+              <w:t>Direkte script</w:t>
+            </w:r>
+          </w:p>
+        </w:tc>
+        <w:tc>
+          <w:tcPr>
+            <w:tcW w:type="dxa" w:w="4997"/>
+            <w:vAlign w:val="center"/>
+            <w:shd w:fill="15364B"/>
+          </w:tcPr>
+          <w:p>
+            <w:pPr>
+              <w:pStyle w:val="M6Small"/>
+              <w:spacing w:after="80" w:before="80"/>
+            </w:pPr>
+            <w:r>
+              <w:rPr>
+                <w:b/>
+                <w:color w:val="FFFFFF"/>
+                <w:sz w:val="18"/>
+              </w:rPr>
+              <w:t>Formål og kørsel</w:t>
+            </w:r>
+          </w:p>
+        </w:tc>
+      </w:tr>
+      <w:tr>
+        <w:trPr>
+          <w:cantSplit/>
+        </w:trPr>
+        <w:tc>
+          <w:tcPr>
+            <w:tcW w:type="dxa" w:w="4320"/>
+            <w:vAlign w:val="top"/>
+            <w:shd w:fill="F0F5F7"/>
+          </w:tcPr>
+          <w:p>
+            <w:pPr>
+              <w:pStyle w:val="M6Small"/>
+              <w:keepNext w:val="0"/>
+              <w:spacing w:before="80" w:after="80"/>
+            </w:pPr>
+            <w:r>
+              <w:rPr>
+                <w:rFonts w:ascii="Liberation Mono" w:hAnsi="Liberation Mono"/>
+                <w:sz w:val="16"/>
+              </w:rPr>
+              <w:t>scripts/setup.sh</w:t>
+            </w:r>
+          </w:p>
+        </w:tc>
+        <w:tc>
+          <w:tcPr>
+            <w:tcW w:type="dxa" w:w="5328"/>
+            <w:vAlign w:val="top"/>
+            <w:shd w:fill="F0F5F7"/>
+          </w:tcPr>
+          <w:p>
+            <w:pPr>
+              <w:pStyle w:val="M6Small"/>
+              <w:keepNext w:val="0"/>
+              <w:spacing w:before="80" w:after="80"/>
+            </w:pPr>
+            <w:r>
+              <w:rPr>
+                <w:sz w:val="17"/>
+              </w:rPr>
+              <w:t>Opsætning og preflight:</w:t>
+              <w:br/>
+              <w:t>sudo bash scripts/setup.sh --check</w:t>
+              <w:br/>
+              <w:t>Efter kontrol: --apply --console-confirmed.</w:t>
+            </w:r>
+          </w:p>
+        </w:tc>
+      </w:tr>
+      <w:tr>
+        <w:trPr>
+          <w:cantSplit/>
+        </w:trPr>
+        <w:tc>
+          <w:tcPr>
+            <w:tcW w:type="dxa" w:w="4320"/>
+            <w:vAlign w:val="top"/>
+          </w:tcPr>
+          <w:p>
+            <w:pPr>
+              <w:pStyle w:val="M6Small"/>
+              <w:keepNext w:val="0"/>
+              <w:spacing w:before="80" w:after="80"/>
+            </w:pPr>
+            <w:r>
+              <w:rPr>
+                <w:rFonts w:ascii="Liberation Mono" w:hAnsi="Liberation Mono"/>
+                <w:sz w:val="16"/>
+              </w:rPr>
+              <w:t>scripts/healthcheck.sh</w:t>
+            </w:r>
+          </w:p>
+        </w:tc>
+        <w:tc>
+          <w:tcPr>
+            <w:tcW w:type="dxa" w:w="5328"/>
+            <w:vAlign w:val="top"/>
+          </w:tcPr>
+          <w:p>
+            <w:pPr>
+              <w:pStyle w:val="M6Small"/>
+              <w:keepNext w:val="0"/>
+              <w:spacing w:before="80" w:after="80"/>
+            </w:pPr>
+            <w:r>
+              <w:rPr>
+                <w:sz w:val="17"/>
+              </w:rPr>
+              <w:t>Læsende kontrol:</w:t>
+              <w:br/>
+              <w:t>sudo bash scripts/healthcheck.sh</w:t>
+              <w:br/>
+              <w:t>Installeret: sudo /usr/local/sbin/securebase-healthcheck.</w:t>
+            </w:r>
+          </w:p>
+        </w:tc>
+      </w:tr>
+      <w:tr>
+        <w:trPr>
+          <w:cantSplit/>
+        </w:trPr>
+        <w:tc>
+          <w:tcPr>
+            <w:tcW w:type="dxa" w:w="4320"/>
+            <w:vAlign w:val="top"/>
+            <w:shd w:fill="F0F5F7"/>
+          </w:tcPr>
+          <w:p>
+            <w:pPr>
+              <w:pStyle w:val="M6Small"/>
+              <w:keepNext w:val="0"/>
+              <w:spacing w:before="80" w:after="80"/>
+            </w:pPr>
+            <w:r>
+              <w:rPr>
+                <w:rFonts w:ascii="Liberation Mono" w:hAnsi="Liberation Mono"/>
+                <w:sz w:val="16"/>
+              </w:rPr>
+              <w:t>scripts/monitor.sh</w:t>
+            </w:r>
+          </w:p>
+        </w:tc>
+        <w:tc>
+          <w:tcPr>
+            <w:tcW w:type="dxa" w:w="5328"/>
+            <w:vAlign w:val="top"/>
+            <w:shd w:fill="F0F5F7"/>
+          </w:tcPr>
+          <w:p>
+            <w:pPr>
+              <w:pStyle w:val="M6Small"/>
+              <w:keepNext w:val="0"/>
+              <w:spacing w:before="80" w:after="80"/>
+            </w:pPr>
+            <w:r>
+              <w:rPr>
+                <w:sz w:val="17"/>
+              </w:rPr>
+              <w:t>Ressourcemåling:</w:t>
+              <w:br/>
+              <w:t>bash scripts/monitor.sh --sample</w:t>
+              <w:br/>
+              <w:t>Test af grænser: --self-test. Normal drift via cron.</w:t>
+            </w:r>
+          </w:p>
+        </w:tc>
+      </w:tr>
+    </w:tbl>
+    <w:p>
+      <w:pPr>
+        <w:pStyle w:val="M6H2"/>
+      </w:pPr>
+      <w:r>
+        <w:t>Eksempeloutput fra det færdige system</w:t>
+      </w:r>
+    </w:p>
+    <w:p>
+      <w:pPr>
+        <w:pStyle w:val="M6Small"/>
+      </w:pPr>
+      <w:r>
+        <w:t>Forkortet uddrag af det observerede healthcheck. Resultatet fra testen den 18. september var 19 OK / 1 WARN / 0 FAIL; advarslen vedrører who/utmp, mens logind viste sessionerne. Det er testoutput, ikke en ny kørsel den 19. september.</w:t>
+      </w:r>
+    </w:p>
+    <w:p>
+      <w:pPr>
+        <w:pStyle w:val="M6Code"/>
+      </w:pPr>
+      <w:r>
+        <w:t>UID 0-konti: root</w:t>
+        <w:br/>
+        <w:t>[OK] Kun root har UID 0 i den tilgaengelige NSS-opslagning</w:t>
+        <w:br/>
+        <w:t>[OK] SSH service/socket aktiv</w:t>
+        <w:br/>
+        <w:t>[OK] permitrootlogin no</w:t>
+        <w:br/>
+        <w:t>[OK] passwordauthentication no</w:t>
+        <w:br/>
+        <w:t>[OK] authenticationmethods publickey</w:t>
+        <w:br/>
+        <w:t>[OK] Admin er ikke i sudo-gruppen</w:t>
+        <w:br/>
+        <w:t>[OK] cron.service aktiv</w:t>
+        <w:br/>
+        <w:t>[OK] logrotate.timer aktiv</w:t>
+        <w:br/>
+        <w:t>[OK] Monitorlog indeholder en frisk maaling</w:t>
+        <w:br/>
+        <w:br/>
+        <w:t>19 OK   1 WARN   0 FAIL</w:t>
+        <w:br/>
+        <w:t>RESULTAT: WARN - gennemgaa bemaerkningerne</w:t>
+      </w:r>
+    </w:p>
+    <w:p>
+      <w:pPr>
+        <w:pStyle w:val="M6Small"/>
+      </w:pPr>
+      <w:r>
+        <w:t>Healthcheck: returkode 0 = PASS, 1 = WARN, 2 = FAIL. Scriptet ændrer ikke systemkonfigurationen.</w:t>
+      </w:r>
+    </w:p>
+    <w:p>
+      <w:pPr>
+        <w:pStyle w:val="M6H1"/>
+        <w:pageBreakBefore/>
+      </w:pPr>
+      <w:r>
+        <w:t>20.1 Interne moduler og bibliotek</w:t>
+      </w:r>
+    </w:p>
+    <w:p>
+      <w:pPr>
+        <w:pStyle w:val="M6Body"/>
+      </w:pPr>
+      <w:r>
+        <w:t>Disse filer indlæses af scripts/setup.sh. Dermed får funktionerne den validerede konfiguration, fælles fejlhåndtering og den planlagte rækkefølge. Nummeret i filnavnet er ikke i sig selv rækkefølgen; netværket håndteres til sidst.</w:t>
+      </w:r>
+    </w:p>
+    <w:tbl>
+      <w:tblPr>
+        <w:tblW w:type="auto" w:w="0"/>
+        <w:jc w:val="center"/>
+        <w:tblLayout w:type="fixed"/>
+        <w:tblLook w:firstColumn="1" w:firstRow="1" w:lastColumn="0" w:lastRow="0" w:noHBand="0" w:noVBand="1" w:val="04A0"/>
+      </w:tblPr>
+      <w:tblGrid>
+        <w:gridCol w:w="4320"/>
+        <w:gridCol w:w="5328"/>
+      </w:tblGrid>
+      <w:tr>
+        <w:trPr>
+          <w:tblHeader/>
+        </w:trPr>
+        <w:tc>
+          <w:tcPr>
+            <w:tcW w:type="dxa" w:w="4997"/>
+            <w:vAlign w:val="center"/>
+            <w:shd w:fill="15364B"/>
+          </w:tcPr>
+          <w:p>
+            <w:pPr>
+              <w:pStyle w:val="M6Small"/>
+              <w:spacing w:after="80" w:before="80"/>
+            </w:pPr>
+            <w:r>
+              <w:rPr>
+                <w:b/>
+                <w:color w:val="FFFFFF"/>
+                <w:sz w:val="18"/>
+              </w:rPr>
+              <w:t>Fil</w:t>
+            </w:r>
+          </w:p>
+        </w:tc>
+        <w:tc>
+          <w:tcPr>
+            <w:tcW w:type="dxa" w:w="4997"/>
+            <w:vAlign w:val="center"/>
+            <w:shd w:fill="15364B"/>
+          </w:tcPr>
+          <w:p>
+            <w:pPr>
+              <w:pStyle w:val="M6Small"/>
+              <w:spacing w:after="80" w:before="80"/>
+            </w:pPr>
+            <w:r>
+              <w:rPr>
+                <w:b/>
+                <w:color w:val="FFFFFF"/>
+                <w:sz w:val="18"/>
+              </w:rPr>
+              <w:t>Formål og kørsel</w:t>
+            </w:r>
+          </w:p>
+        </w:tc>
+      </w:tr>
+      <w:tr>
+        <w:trPr>
+          <w:cantSplit/>
+        </w:trPr>
+        <w:tc>
+          <w:tcPr>
+            <w:tcW w:type="dxa" w:w="4320"/>
+            <w:vAlign w:val="top"/>
+            <w:shd w:fill="F0F5F7"/>
+          </w:tcPr>
+          <w:p>
+            <w:pPr>
+              <w:pStyle w:val="M6Small"/>
+              <w:keepNext w:val="0"/>
+              <w:spacing w:before="80" w:after="80"/>
+            </w:pPr>
+            <w:r>
+              <w:rPr>
+                <w:rFonts w:ascii="Liberation Mono" w:hAnsi="Liberation Mono"/>
+                <w:sz w:val="16"/>
+              </w:rPr>
+              <w:t>scripts/lib/common.sh</w:t>
+            </w:r>
+          </w:p>
+        </w:tc>
+        <w:tc>
+          <w:tcPr>
+            <w:tcW w:type="dxa" w:w="5328"/>
+            <w:vAlign w:val="top"/>
+            <w:shd w:fill="F0F5F7"/>
+          </w:tcPr>
+          <w:p>
+            <w:pPr>
+              <w:pStyle w:val="M6Small"/>
+              <w:keepNext w:val="0"/>
+              <w:spacing w:before="80" w:after="80"/>
+            </w:pPr>
+            <w:r>
+              <w:rPr>
+                <w:sz w:val="17"/>
+              </w:rPr>
+              <w:t>Fælles konfiguration, status, backup og idempotent filinstallation. Sources af setup; ikke direkte kørsel.</w:t>
+            </w:r>
+          </w:p>
+        </w:tc>
+      </w:tr>
+      <w:tr>
+        <w:trPr>
+          <w:cantSplit/>
+        </w:trPr>
+        <w:tc>
+          <w:tcPr>
+            <w:tcW w:type="dxa" w:w="4320"/>
+            <w:vAlign w:val="top"/>
+          </w:tcPr>
+          <w:p>
+            <w:pPr>
+              <w:pStyle w:val="M6Small"/>
+              <w:keepNext w:val="0"/>
+              <w:spacing w:before="80" w:after="80"/>
+            </w:pPr>
+            <w:r>
+              <w:rPr>
+                <w:rFonts w:ascii="Liberation Mono" w:hAnsi="Liberation Mono"/>
+                <w:sz w:val="16"/>
+              </w:rPr>
+              <w:t>scripts/modules/00-preflight.sh</w:t>
+            </w:r>
+          </w:p>
+        </w:tc>
+        <w:tc>
+          <w:tcPr>
+            <w:tcW w:type="dxa" w:w="5328"/>
+            <w:vAlign w:val="top"/>
+          </w:tcPr>
+          <w:p>
+            <w:pPr>
+              <w:pStyle w:val="M6Small"/>
+              <w:keepNext w:val="0"/>
+              <w:spacing w:before="80" w:after="80"/>
+            </w:pPr>
+            <w:r>
+              <w:rPr>
+                <w:sz w:val="17"/>
+              </w:rPr>
+              <w:t>preflight(): platform, konto, konfiguration og konflikter. Kaldes af setup ved --check og før --apply.</w:t>
+            </w:r>
+          </w:p>
+        </w:tc>
+      </w:tr>
+      <w:tr>
+        <w:trPr>
+          <w:cantSplit/>
+        </w:trPr>
+        <w:tc>
+          <w:tcPr>
+            <w:tcW w:type="dxa" w:w="4320"/>
+            <w:vAlign w:val="top"/>
+            <w:shd w:fill="F0F5F7"/>
+          </w:tcPr>
+          <w:p>
+            <w:pPr>
+              <w:pStyle w:val="M6Small"/>
+              <w:keepNext w:val="0"/>
+              <w:spacing w:before="80" w:after="80"/>
+            </w:pPr>
+            <w:r>
+              <w:rPr>
+                <w:rFonts w:ascii="Liberation Mono" w:hAnsi="Liberation Mono"/>
+                <w:sz w:val="16"/>
+              </w:rPr>
+              <w:t>scripts/modules/01-system.sh</w:t>
+            </w:r>
+          </w:p>
+        </w:tc>
+        <w:tc>
+          <w:tcPr>
+            <w:tcW w:type="dxa" w:w="5328"/>
+            <w:vAlign w:val="top"/>
+            <w:shd w:fill="F0F5F7"/>
+          </w:tcPr>
+          <w:p>
+            <w:pPr>
+              <w:pStyle w:val="M6Small"/>
+              <w:keepNext w:val="0"/>
+              <w:spacing w:before="80" w:after="80"/>
+            </w:pPr>
+            <w:r>
+              <w:rPr>
+                <w:sz w:val="17"/>
+              </w:rPr>
+              <w:t>system_setup(): pakker og hostname. Kaldes af setup ved --apply.</w:t>
+            </w:r>
+          </w:p>
+        </w:tc>
+      </w:tr>
+      <w:tr>
+        <w:trPr>
+          <w:cantSplit/>
+        </w:trPr>
+        <w:tc>
+          <w:tcPr>
+            <w:tcW w:type="dxa" w:w="4320"/>
+            <w:vAlign w:val="top"/>
+          </w:tcPr>
+          <w:p>
+            <w:pPr>
+              <w:pStyle w:val="M6Small"/>
+              <w:keepNext w:val="0"/>
+              <w:spacing w:before="80" w:after="80"/>
+            </w:pPr>
+            <w:r>
+              <w:rPr>
+                <w:rFonts w:ascii="Liberation Mono" w:hAnsi="Liberation Mono"/>
+                <w:sz w:val="16"/>
+              </w:rPr>
+              <w:t>scripts/modules/02-network.sh</w:t>
+            </w:r>
+          </w:p>
+        </w:tc>
+        <w:tc>
+          <w:tcPr>
+            <w:tcW w:type="dxa" w:w="5328"/>
+            <w:vAlign w:val="top"/>
+          </w:tcPr>
+          <w:p>
+            <w:pPr>
+              <w:pStyle w:val="M6Small"/>
+              <w:keepNext w:val="0"/>
+              <w:spacing w:before="80" w:after="80"/>
+            </w:pPr>
+            <w:r>
+              <w:rPr>
+                <w:sz w:val="17"/>
+              </w:rPr>
+              <w:t>network_setup(): single-NIC Netplan. Kaldes via setup ved CONFIGURE_NETWORK="yes".</w:t>
+            </w:r>
+          </w:p>
+        </w:tc>
+      </w:tr>
+      <w:tr>
+        <w:trPr>
+          <w:cantSplit/>
+        </w:trPr>
+        <w:tc>
+          <w:tcPr>
+            <w:tcW w:type="dxa" w:w="4320"/>
+            <w:vAlign w:val="top"/>
+            <w:shd w:fill="F0F5F7"/>
+          </w:tcPr>
+          <w:p>
+            <w:pPr>
+              <w:pStyle w:val="M6Small"/>
+              <w:keepNext w:val="0"/>
+              <w:spacing w:before="80" w:after="80"/>
+            </w:pPr>
+            <w:r>
+              <w:rPr>
+                <w:rFonts w:ascii="Liberation Mono" w:hAnsi="Liberation Mono"/>
+                <w:sz w:val="16"/>
+              </w:rPr>
+              <w:t>scripts/modules/03-users.sh</w:t>
+            </w:r>
+          </w:p>
+        </w:tc>
+        <w:tc>
+          <w:tcPr>
+            <w:tcW w:type="dxa" w:w="5328"/>
+            <w:vAlign w:val="top"/>
+            <w:shd w:fill="F0F5F7"/>
+          </w:tcPr>
+          <w:p>
+            <w:pPr>
+              <w:pStyle w:val="M6Small"/>
+              <w:keepNext w:val="0"/>
+              <w:spacing w:before="80" w:after="80"/>
+            </w:pPr>
+            <w:r>
+              <w:rPr>
+                <w:sz w:val="17"/>
+              </w:rPr>
+              <w:t>users_setup(): rollegrupper, konti og medlemskaber. Kaldes via setup.</w:t>
+            </w:r>
+          </w:p>
+        </w:tc>
+      </w:tr>
+      <w:tr>
+        <w:trPr>
+          <w:cantSplit/>
+        </w:trPr>
+        <w:tc>
+          <w:tcPr>
+            <w:tcW w:type="dxa" w:w="4320"/>
+            <w:vAlign w:val="top"/>
+          </w:tcPr>
+          <w:p>
+            <w:pPr>
+              <w:pStyle w:val="M6Small"/>
+              <w:keepNext w:val="0"/>
+              <w:spacing w:before="80" w:after="80"/>
+            </w:pPr>
+            <w:r>
+              <w:rPr>
+                <w:rFonts w:ascii="Liberation Mono" w:hAnsi="Liberation Mono"/>
+                <w:sz w:val="16"/>
+              </w:rPr>
+              <w:t>scripts/modules/04-storage-acl.sh</w:t>
+            </w:r>
+          </w:p>
+        </w:tc>
+        <w:tc>
+          <w:tcPr>
+            <w:tcW w:type="dxa" w:w="5328"/>
+            <w:vAlign w:val="top"/>
+          </w:tcPr>
+          <w:p>
+            <w:pPr>
+              <w:pStyle w:val="M6Small"/>
+              <w:keepNext w:val="0"/>
+              <w:spacing w:before="80" w:after="80"/>
+            </w:pPr>
+            <w:r>
+              <w:rPr>
+                <w:sz w:val="17"/>
+              </w:rPr>
+              <w:t>storage_setup(): projektmappe, SGID og ACL. Kaldes via setup.</w:t>
+            </w:r>
+          </w:p>
+        </w:tc>
+      </w:tr>
+      <w:tr>
+        <w:trPr>
+          <w:cantSplit/>
+        </w:trPr>
+        <w:tc>
+          <w:tcPr>
+            <w:tcW w:type="dxa" w:w="4320"/>
+            <w:vAlign w:val="top"/>
+            <w:shd w:fill="F0F5F7"/>
+          </w:tcPr>
+          <w:p>
+            <w:pPr>
+              <w:pStyle w:val="M6Small"/>
+              <w:keepNext w:val="0"/>
+              <w:spacing w:before="80" w:after="80"/>
+            </w:pPr>
+            <w:r>
+              <w:rPr>
+                <w:rFonts w:ascii="Liberation Mono" w:hAnsi="Liberation Mono"/>
+                <w:sz w:val="16"/>
+              </w:rPr>
+              <w:t>scripts/modules/05-ssh.sh</w:t>
+            </w:r>
+          </w:p>
+        </w:tc>
+        <w:tc>
+          <w:tcPr>
+            <w:tcW w:type="dxa" w:w="5328"/>
+            <w:vAlign w:val="top"/>
+            <w:shd w:fill="F0F5F7"/>
+          </w:tcPr>
+          <w:p>
+            <w:pPr>
+              <w:pStyle w:val="M6Small"/>
+              <w:keepNext w:val="0"/>
+              <w:spacing w:before="80" w:after="80"/>
+            </w:pPr>
+            <w:r>
+              <w:rPr>
+                <w:sz w:val="17"/>
+              </w:rPr>
+              <w:t>ssh_setup(): public key, KEY-OK-stop og SSH-hærdning. Kaldes via setup.</w:t>
+            </w:r>
+          </w:p>
+        </w:tc>
+      </w:tr>
+      <w:tr>
+        <w:trPr>
+          <w:cantSplit/>
+        </w:trPr>
+        <w:tc>
+          <w:tcPr>
+            <w:tcW w:type="dxa" w:w="4320"/>
+            <w:vAlign w:val="top"/>
+          </w:tcPr>
+          <w:p>
+            <w:pPr>
+              <w:pStyle w:val="M6Small"/>
+              <w:keepNext w:val="0"/>
+              <w:spacing w:before="80" w:after="80"/>
+            </w:pPr>
+            <w:r>
+              <w:rPr>
+                <w:rFonts w:ascii="Liberation Mono" w:hAnsi="Liberation Mono"/>
+                <w:sz w:val="16"/>
+              </w:rPr>
+              <w:t>scripts/modules/06-sudo.sh</w:t>
+            </w:r>
+          </w:p>
+        </w:tc>
+        <w:tc>
+          <w:tcPr>
+            <w:tcW w:type="dxa" w:w="5328"/>
+            <w:vAlign w:val="top"/>
+          </w:tcPr>
+          <w:p>
+            <w:pPr>
+              <w:pStyle w:val="M6Small"/>
+              <w:keepNext w:val="0"/>
+              <w:spacing w:before="80" w:after="80"/>
+            </w:pPr>
+            <w:r>
+              <w:rPr>
+                <w:sz w:val="17"/>
+              </w:rPr>
+              <w:t>sudo_setup(): tre specifikke regler og negativ sudo-test. Kaldes via setup.</w:t>
+            </w:r>
+          </w:p>
+        </w:tc>
+      </w:tr>
+      <w:tr>
+        <w:trPr>
+          <w:cantSplit/>
+        </w:trPr>
+        <w:tc>
+          <w:tcPr>
+            <w:tcW w:type="dxa" w:w="4320"/>
+            <w:vAlign w:val="top"/>
+            <w:shd w:fill="F0F5F7"/>
+          </w:tcPr>
+          <w:p>
+            <w:pPr>
+              <w:pStyle w:val="M6Small"/>
+              <w:keepNext w:val="0"/>
+              <w:spacing w:before="80" w:after="80"/>
+            </w:pPr>
+            <w:r>
+              <w:rPr>
+                <w:rFonts w:ascii="Liberation Mono" w:hAnsi="Liberation Mono"/>
+                <w:sz w:val="16"/>
+              </w:rPr>
+              <w:t>scripts/modules/07-firewall.sh</w:t>
+            </w:r>
+          </w:p>
+        </w:tc>
+        <w:tc>
+          <w:tcPr>
+            <w:tcW w:type="dxa" w:w="5328"/>
+            <w:vAlign w:val="top"/>
+            <w:shd w:fill="F0F5F7"/>
+          </w:tcPr>
+          <w:p>
+            <w:pPr>
+              <w:pStyle w:val="M6Small"/>
+              <w:keepNext w:val="0"/>
+              <w:spacing w:before="80" w:after="80"/>
+            </w:pPr>
+            <w:r>
+              <w:rPr>
+                <w:sz w:val="17"/>
+              </w:rPr>
+              <w:t>firewall_setup(): UFW-politik og SSH-kilderegel. Kaldes via setup.</w:t>
+            </w:r>
+          </w:p>
+        </w:tc>
+      </w:tr>
+      <w:tr>
+        <w:trPr>
+          <w:cantSplit/>
+        </w:trPr>
+        <w:tc>
+          <w:tcPr>
+            <w:tcW w:type="dxa" w:w="4320"/>
+            <w:vAlign w:val="top"/>
+          </w:tcPr>
+          <w:p>
+            <w:pPr>
+              <w:pStyle w:val="M6Small"/>
+              <w:keepNext w:val="0"/>
+              <w:spacing w:before="80" w:after="80"/>
+            </w:pPr>
+            <w:r>
+              <w:rPr>
+                <w:rFonts w:ascii="Liberation Mono" w:hAnsi="Liberation Mono"/>
+                <w:sz w:val="16"/>
+              </w:rPr>
+              <w:t>scripts/modules/08-monitoring.sh</w:t>
+            </w:r>
+          </w:p>
+        </w:tc>
+        <w:tc>
+          <w:tcPr>
+            <w:tcW w:type="dxa" w:w="5328"/>
+            <w:vAlign w:val="top"/>
+          </w:tcPr>
+          <w:p>
+            <w:pPr>
+              <w:pStyle w:val="M6Small"/>
+              <w:keepNext w:val="0"/>
+              <w:spacing w:before="80" w:after="80"/>
+            </w:pPr>
+            <w:r>
+              <w:rPr>
+                <w:sz w:val="17"/>
+              </w:rPr>
+              <w:t>monitoring_setup(): monitor, cron, Logrotate og tjenester. Kaldes via setup.</w:t>
+            </w:r>
+          </w:p>
+        </w:tc>
+      </w:tr>
+    </w:tbl>
+    <w:p>
+      <w:pPr>
+        <w:pStyle w:val="M6Small"/>
+      </w:pPr>
+      <w:r>
+        <w:t>Modulerne skal ikke køres enkeltvis med sudo bash. Det ville omgå den sammenhæng og de kontroller, som hovedscriptet etablerer.</w:t>
+      </w:r>
+    </w:p>
+    <w:p>
+      <w:pPr>
+        <w:pStyle w:val="M6H1"/>
+        <w:pageBreakBefore/>
+      </w:pPr>
+      <w:r>
+        <w:t>20.2 Hjælpeværktøjer og testreference</w:t>
+      </w:r>
+    </w:p>
+    <w:tbl>
+      <w:tblPr>
+        <w:tblW w:type="auto" w:w="0"/>
+        <w:jc w:val="center"/>
+        <w:tblLayout w:type="fixed"/>
+        <w:tblLook w:firstColumn="1" w:firstRow="1" w:lastColumn="0" w:lastRow="0" w:noHBand="0" w:noVBand="1" w:val="04A0"/>
+      </w:tblPr>
+      <w:tblGrid>
+        <w:gridCol w:w="4320"/>
+        <w:gridCol w:w="5328"/>
+      </w:tblGrid>
+      <w:tr>
+        <w:trPr>
+          <w:tblHeader/>
+        </w:trPr>
+        <w:tc>
+          <w:tcPr>
+            <w:tcW w:type="dxa" w:w="4997"/>
+            <w:vAlign w:val="center"/>
+            <w:shd w:fill="15364B"/>
+          </w:tcPr>
+          <w:p>
+            <w:pPr>
+              <w:pStyle w:val="M6Small"/>
+              <w:spacing w:after="80" w:before="80"/>
+            </w:pPr>
+            <w:r>
+              <w:rPr>
+                <w:b/>
+                <w:color w:val="FFFFFF"/>
+                <w:sz w:val="18"/>
+              </w:rPr>
+              <w:t>Fil</w:t>
+            </w:r>
+          </w:p>
+        </w:tc>
+        <w:tc>
+          <w:tcPr>
+            <w:tcW w:type="dxa" w:w="4997"/>
+            <w:vAlign w:val="center"/>
+            <w:shd w:fill="15364B"/>
+          </w:tcPr>
+          <w:p>
+            <w:pPr>
+              <w:pStyle w:val="M6Small"/>
+              <w:spacing w:after="80" w:before="80"/>
+            </w:pPr>
+            <w:r>
+              <w:rPr>
+                <w:b/>
+                <w:color w:val="FFFFFF"/>
+                <w:sz w:val="18"/>
+              </w:rPr>
+              <w:t>Formål og kørsel</w:t>
+            </w:r>
+          </w:p>
+        </w:tc>
+      </w:tr>
+      <w:tr>
+        <w:trPr>
+          <w:cantSplit/>
+        </w:trPr>
+        <w:tc>
+          <w:tcPr>
+            <w:tcW w:type="dxa" w:w="4320"/>
+            <w:vAlign w:val="top"/>
+            <w:shd w:fill="F0F5F7"/>
+          </w:tcPr>
+          <w:p>
+            <w:pPr>
+              <w:pStyle w:val="M6Small"/>
+              <w:keepNext w:val="0"/>
+              <w:spacing w:before="80" w:after="80"/>
+            </w:pPr>
+            <w:r>
+              <w:rPr>
+                <w:rFonts w:ascii="Liberation Mono" w:hAnsi="Liberation Mono"/>
+                <w:sz w:val="16"/>
+              </w:rPr>
+              <w:t>scripts/tools/validate_config.py</w:t>
+            </w:r>
+          </w:p>
+        </w:tc>
+        <w:tc>
+          <w:tcPr>
+            <w:tcW w:type="dxa" w:w="5328"/>
+            <w:vAlign w:val="top"/>
+            <w:shd w:fill="F0F5F7"/>
+          </w:tcPr>
+          <w:p>
+            <w:pPr>
+              <w:pStyle w:val="M6Small"/>
+              <w:keepNext w:val="0"/>
+              <w:spacing w:before="80" w:after="80"/>
+            </w:pPr>
+            <w:r>
+              <w:rPr>
+                <w:sz w:val="17"/>
+              </w:rPr>
+              <w:t>Validerer config og public key; kaldes i preflight. Manuel læsekontrol:</w:t>
+              <w:br/>
+              <w:t>python3 scripts/tools/validate_config.py config.env .</w:t>
+            </w:r>
+          </w:p>
+        </w:tc>
+      </w:tr>
+      <w:tr>
+        <w:trPr>
+          <w:cantSplit/>
+        </w:trPr>
+        <w:tc>
+          <w:tcPr>
+            <w:tcW w:type="dxa" w:w="4320"/>
+            <w:vAlign w:val="top"/>
+          </w:tcPr>
+          <w:p>
+            <w:pPr>
+              <w:pStyle w:val="M6Small"/>
+              <w:keepNext w:val="0"/>
+              <w:spacing w:before="80" w:after="80"/>
+            </w:pPr>
+            <w:r>
+              <w:rPr>
+                <w:rFonts w:ascii="Liberation Mono" w:hAnsi="Liberation Mono"/>
+                <w:sz w:val="16"/>
+              </w:rPr>
+              <w:t>scripts/tools/netplan_scope.py</w:t>
+            </w:r>
+          </w:p>
+        </w:tc>
+        <w:tc>
+          <w:tcPr>
+            <w:tcW w:type="dxa" w:w="5328"/>
+            <w:vAlign w:val="top"/>
+          </w:tcPr>
+          <w:p>
+            <w:pPr>
+              <w:pStyle w:val="M6Small"/>
+              <w:keepNext w:val="0"/>
+              <w:spacing w:before="80" w:after="80"/>
+            </w:pPr>
+            <w:r>
+              <w:rPr>
+                <w:sz w:val="17"/>
+              </w:rPr>
+              <w:t>Kontrollerer den understøttede netværksmodel. Manuel læsekontrol:</w:t>
+              <w:br/>
+              <w:t>python3 scripts/tools/netplan_scope.py enp0s3</w:t>
+            </w:r>
+          </w:p>
+        </w:tc>
+      </w:tr>
+      <w:tr>
+        <w:trPr>
+          <w:cantSplit/>
+        </w:trPr>
+        <w:tc>
+          <w:tcPr>
+            <w:tcW w:type="dxa" w:w="4320"/>
+            <w:vAlign w:val="top"/>
+            <w:shd w:fill="F0F5F7"/>
+          </w:tcPr>
+          <w:p>
+            <w:pPr>
+              <w:pStyle w:val="M6Small"/>
+              <w:keepNext w:val="0"/>
+              <w:spacing w:before="80" w:after="80"/>
+            </w:pPr>
+            <w:r>
+              <w:rPr>
+                <w:rFonts w:ascii="Liberation Mono" w:hAnsi="Liberation Mono"/>
+                <w:sz w:val="16"/>
+              </w:rPr>
+              <w:t>scripts/tools/check_sudo_listing.py</w:t>
+            </w:r>
+          </w:p>
+        </w:tc>
+        <w:tc>
+          <w:tcPr>
+            <w:tcW w:type="dxa" w:w="5328"/>
+            <w:vAlign w:val="top"/>
+            <w:shd w:fill="F0F5F7"/>
+          </w:tcPr>
+          <w:p>
+            <w:pPr>
+              <w:pStyle w:val="M6Small"/>
+              <w:keepNext w:val="0"/>
+              <w:spacing w:before="80" w:after="80"/>
+            </w:pPr>
+            <w:r>
+              <w:rPr>
+                <w:sz w:val="17"/>
+              </w:rPr>
+              <w:t>Validerer den tilladte sudo-politik. Kaldes af sudo-modulet med sudo -l-output på standard input.</w:t>
+            </w:r>
+          </w:p>
+        </w:tc>
+      </w:tr>
+      <w:tr>
+        <w:trPr>
+          <w:cantSplit/>
+        </w:trPr>
+        <w:tc>
+          <w:tcPr>
+            <w:tcW w:type="dxa" w:w="4320"/>
+            <w:vAlign w:val="top"/>
+          </w:tcPr>
+          <w:p>
+            <w:pPr>
+              <w:pStyle w:val="M6Small"/>
+              <w:keepNext w:val="0"/>
+              <w:spacing w:before="80" w:after="80"/>
+            </w:pPr>
+            <w:r>
+              <w:rPr>
+                <w:rFonts w:ascii="Liberation Mono" w:hAnsi="Liberation Mono"/>
+                <w:sz w:val="16"/>
+              </w:rPr>
+              <w:t>scripts/tools/evidence.sh</w:t>
+            </w:r>
+          </w:p>
+        </w:tc>
+        <w:tc>
+          <w:tcPr>
+            <w:tcW w:type="dxa" w:w="5328"/>
+            <w:vAlign w:val="top"/>
+          </w:tcPr>
+          <w:p>
+            <w:pPr>
+              <w:pStyle w:val="M6Small"/>
+              <w:keepNext w:val="0"/>
+              <w:spacing w:before="80" w:after="80"/>
+            </w:pPr>
+            <w:r>
+              <w:rPr>
+                <w:sz w:val="17"/>
+              </w:rPr>
+              <w:t>Valgfrit læsende konfigurationsmanifest:</w:t>
+              <w:br/>
+              <w:t>sudo bash scripts/tools/evidence.sh | tee securebase-evidence.txt</w:t>
+            </w:r>
+          </w:p>
+        </w:tc>
+      </w:tr>
+      <w:tr>
+        <w:trPr>
+          <w:cantSplit/>
+        </w:trPr>
+        <w:tc>
+          <w:tcPr>
+            <w:tcW w:type="dxa" w:w="4320"/>
+            <w:vAlign w:val="top"/>
+            <w:shd w:fill="F0F5F7"/>
+          </w:tcPr>
+          <w:p>
+            <w:pPr>
+              <w:pStyle w:val="M6Small"/>
+              <w:keepNext w:val="0"/>
+              <w:spacing w:before="80" w:after="80"/>
+            </w:pPr>
+            <w:r>
+              <w:rPr>
+                <w:rFonts w:ascii="Liberation Mono" w:hAnsi="Liberation Mono"/>
+                <w:sz w:val="16"/>
+              </w:rPr>
+              <w:t>scripts/history/monitor-modul5.sh</w:t>
+            </w:r>
+          </w:p>
+        </w:tc>
+        <w:tc>
+          <w:tcPr>
+            <w:tcW w:type="dxa" w:w="5328"/>
+            <w:vAlign w:val="top"/>
+            <w:shd w:fill="F0F5F7"/>
+          </w:tcPr>
+          <w:p>
+            <w:pPr>
+              <w:pStyle w:val="M6Small"/>
+              <w:keepNext w:val="0"/>
+              <w:spacing w:before="80" w:after="80"/>
+            </w:pPr>
+            <w:r>
+              <w:rPr>
+                <w:sz w:val="17"/>
+              </w:rPr>
+              <w:t>Tidligere monitor; installeres ikke. Syntakskontrol:</w:t>
+              <w:br/>
+              <w:t>bash -n scripts/history/monitor-modul5.sh</w:t>
+            </w:r>
+          </w:p>
+        </w:tc>
+      </w:tr>
+    </w:tbl>
+    <w:p>
+      <w:pPr>
+        <w:pStyle w:val="M6H2"/>
+      </w:pPr>
+      <w:r>
+        <w:t>Sammenhæng mellem test og dokumentationsudgave</w:t>
+      </w:r>
+    </w:p>
+    <w:p>
+      <w:pPr>
+        <w:pStyle w:val="M6Body"/>
+      </w:pPr>
+      <w:r>
+        <w:t>Testen den 18. september 2026 anvendte v1.2-scriptstrukturen på en frisk Ubuntu Server 26.04.1-VM. Første apply rapporterede 12 ændrede administrerede filer; anden apply 0. Efter genkørslen blev en ny SSH-session og de tre afgrænsede NOPASSWD-kommandoer kontrolleret.</w:t>
+      </w:r>
+    </w:p>
+    <w:p>
+      <w:pPr>
+        <w:pStyle w:val="M6Body"/>
+      </w:pPr>
+      <w:r>
+        <w:t>De 16 supplerende screenshots findes i evidence/06-scripting/v1.2-2026-09-18/. Rapportens 87 oprindelige billeder er bevaret med deres testdatoer. Versionsangivelse 1.3.2 gælder den redigerede dokumentation; scripts er uændrede fra 1.3.1, hvor der kun var tilføjet dokumentationskommentarer til det verificerede grundlag.</w:t>
+      </w:r>
+    </w:p>
+    <w:p>
+      <w:pPr>
+        <w:pStyle w:val="M6Small"/>
+      </w:pPr>
+      <w:r>
+        <w:t>Ingen ny fuld Ubuntu-installation er udført for den redaktionelle 1.3.2-udgave. Genkørslen er ikke en hash-sammenligning af hele systemet, og who/utmp-advarslen er fortsat en del af det dokumenterede resultat.</w:t>
+      </w:r>
+    </w:p>
+    <w:p>
+      <w:pPr>
+        <w:pStyle w:val="M6H2"/>
+      </w:pPr>
+      <w:r>
+        <w:t>Dokumentation og kildekode</w:t>
+      </w:r>
+    </w:p>
+    <w:p>
+      <w:pPr>
+        <w:pStyle w:val="M6Small"/>
+      </w:pPr>
+      <w:r>
+        <w:t>Scriptvejledning: scripts/README.md</w:t>
+        <w:br/>
+        <w:t>Faglig dokumentation: docs/06-scripting.md</w:t>
+        <w:br/>
+        <w:t>VM-test: docs/VM_TEST_REPORT.md</w:t>
+      </w:r>
+    </w:p>
+    <w:p>
+      <w:pPr>
+        <w:pStyle w:val="M6Small"/>
+      </w:pPr>
+      <w:hyperlink r:id="rId109">
+        <w:r>
+          <w:rPr>
+            <w:color w:val="087F8C"/>
+          </w:rPr>
+          <w:t>Afleveringssite: khr-spec.github.io/SecureBase-Linux101/</w:t>
+        </w:r>
+      </w:hyperlink>
+    </w:p>
+    <w:p>
+      <w:pPr>
+        <w:pStyle w:val="M6Small"/>
+      </w:pPr>
+      <w:hyperlink r:id="rId110">
+        <w:r>
+          <w:rPr>
+            <w:color w:val="087F8C"/>
+          </w:rPr>
+          <w:t>Repository: github.com/khr-spec/SecureBase-Linux101</w:t>
+        </w:r>
+      </w:hyperlink>
     </w:p>
     <w:sectPr>
       <w:headerReference w:type="default" r:id="rId89"/>

</xml_diff>